<commit_message>
feat(KPI): update collision detection stop report draft
</commit_message>
<xml_diff>
--- a/KPI/TE02_020/TE02_020_collision_detection_stop_report_draft.docx
+++ b/KPI/TE02_020/TE02_020_collision_detection_stop_report_draft.docx
@@ -38,12 +38,12 @@
     </w:p>
     <w:p>
       <w:r>
-        <w:t xml:space="preserve">After the setup motion, the notebook sends GOAL_B as the measured KPI action. During GOAL_B execution, the virtual walls are inserted into the MoveIt planning scene. The controller then monitors the active trajectory and publishes diagnostic events on /te02_020/collision_avoidance_event.</w:t>
-      </w:r>
-    </w:p>
-    <w:p>
-      <w:r>
-        <w:t xml:space="preserve">The KPI response time is measured from the collision_predicted event to the robot_stopped_for_collision event. A trial passes when the obstacle is applied successfully, collision_predicted is observed, robot_stopped_for_collision is observed, the detection-to-stop time is below 250 ms, and no hit/contact/impact is reported before the stop. Replanning and final action completion are not used as pass/fail criteria for this KPI.</w:t>
+        <w:t xml:space="preserve">After the setup motion, the notebook sends GOAL_B as the measured KPI action. During GOAL_B execution, the virtual walls are inserted into the MoveIt planning scene. The controller monitors the active trajectory and publishes diagnostic events used to identify collision_predicted and robot_stopped_for_collision.</w:t>
+      </w:r>
+    </w:p>
+    <w:p>
+      <w:r>
+        <w:t xml:space="preserve">The KPI response time is measured from collision_predicted to robot_stopped_for_collision. A trial passes when the obstacle is applied successfully, collision_predicted is observed, robot_stopped_for_collision is observed, the detection-to-stop time is below 250 ms, and no hit/contact/impact is reported before the stop. Replanning and final action completion are recorded only as diagnostics and are not used as pass/fail criteria for this KPI.</w:t>
       </w:r>
     </w:p>
     <w:p>
@@ -61,7 +61,12 @@
     </w:p>
     <w:p>
       <w:r>
-        <w:t xml:space="preserve">The measured detection-to-stop response time remained below the 250 ms KPI threshold in every trial. The p95 response time was 90.077 ms and the maximum observed response time was 94.532 ms. No hit, contact, or impact event was observed before the stop in any measured trial.</w:t>
+        <w:t xml:space="preserve">The measured detection-to-stop response time remained below the 250 ms KPI threshold in every trial. The p95 response time was 89.785 ms and the maximum observed response time was 90.031 ms. No hit, contact, or impact event was observed before the stop in any measured trial.</w:t>
+      </w:r>
+    </w:p>
+    <w:p>
+      <w:r>
+        <w:t xml:space="preserve">The obstacle-to-detection timing is included only as supporting diagnostic information because it depends on the point in the trajectory where the virtual obstacle is injected. The diagnostic p95 obstacle-to-detection time was 331.789 ms, and the maximum was 438.505 ms.</w:t>
       </w:r>
     </w:p>
     <w:tbl>
@@ -285,7 +290,7 @@
           </w:tcPr>
           <w:p>
             <w:r>
-              <w:t xml:space="preserve">90.077 ms</w:t>
+              <w:t xml:space="preserve">89.785 ms</w:t>
             </w:r>
           </w:p>
         </w:tc>
@@ -317,7 +322,7 @@
           </w:tcPr>
           <w:p>
             <w:r>
-              <w:t xml:space="preserve">94.532 ms</w:t>
+              <w:t xml:space="preserve">90.031 ms</w:t>
             </w:r>
           </w:p>
         </w:tc>
@@ -513,7 +518,7 @@
           </w:tcPr>
           <w:p>
             <w:r>
-              <w:t xml:space="preserve">0.977</w:t>
+              <w:t xml:space="preserve">90.031</w:t>
             </w:r>
           </w:p>
         </w:tc>
@@ -575,7 +580,7 @@
           </w:tcPr>
           <w:p>
             <w:r>
-              <w:t xml:space="preserve">67.249</w:t>
+              <w:t xml:space="preserve">67.148</w:t>
             </w:r>
           </w:p>
         </w:tc>
@@ -637,7 +642,7 @@
           </w:tcPr>
           <w:p>
             <w:r>
-              <w:t xml:space="preserve">84.633</w:t>
+              <w:t xml:space="preserve">46.52</w:t>
             </w:r>
           </w:p>
         </w:tc>
@@ -699,7 +704,7 @@
           </w:tcPr>
           <w:p>
             <w:r>
-              <w:t xml:space="preserve">65.914</w:t>
+              <w:t xml:space="preserve">45.521</w:t>
             </w:r>
           </w:p>
         </w:tc>
@@ -761,7 +766,7 @@
           </w:tcPr>
           <w:p>
             <w:r>
-              <w:t xml:space="preserve">76.069</w:t>
+              <w:t xml:space="preserve">89.484</w:t>
             </w:r>
           </w:p>
         </w:tc>
@@ -823,7 +828,7 @@
           </w:tcPr>
           <w:p>
             <w:r>
-              <w:t xml:space="preserve">79.894</w:t>
+              <w:t xml:space="preserve">62.175</w:t>
             </w:r>
           </w:p>
         </w:tc>
@@ -885,7 +890,7 @@
           </w:tcPr>
           <w:p>
             <w:r>
-              <w:t xml:space="preserve">94.532</w:t>
+              <w:t xml:space="preserve">73.616</w:t>
             </w:r>
           </w:p>
         </w:tc>
@@ -947,7 +952,7 @@
           </w:tcPr>
           <w:p>
             <w:r>
-              <w:t xml:space="preserve">78.398</w:t>
+              <w:t xml:space="preserve">1.321</w:t>
             </w:r>
           </w:p>
         </w:tc>
@@ -1009,7 +1014,7 @@
           </w:tcPr>
           <w:p>
             <w:r>
-              <w:t xml:space="preserve">83.042</w:t>
+              <w:t xml:space="preserve">70.745</w:t>
             </w:r>
           </w:p>
         </w:tc>
@@ -1071,7 +1076,7 @@
           </w:tcPr>
           <w:p>
             <w:r>
-              <w:t xml:space="preserve">84.14</w:t>
+              <w:t xml:space="preserve">86.751</w:t>
             </w:r>
           </w:p>
         </w:tc>
@@ -1107,7 +1112,7 @@
     </w:p>
     <w:p>
       <w:r>
-        <w:t xml:space="preserve">TE02_020 passes. The controller detected the injected obstacles and produced the stop response in all 10 measured GOAL_B trials. The measured success rate was 100.0%, which exceeds the &gt;95% requirement, and the maximum detection-to-stop response was 94.532 ms, which is below the 250 ms response-time limit.</w:t>
+        <w:t xml:space="preserve">TE02_020 passes. The controller detected the injected obstacles and produced the stop response in all 10 measured GOAL_B trials. The measured success rate was 100.0%, which exceeds the &gt;95% requirement, and the maximum detection-to-stop response was 90.031 ms, which is below the 250 ms response-time limit.</w:t>
       </w:r>
     </w:p>
     <w:sectPr>

</xml_diff>